<commit_message>
feat: zip for liverable
</commit_message>
<xml_diff>
--- a/livrable/rattrapage UE04 Produit et Storytelling.docx
+++ b/livrable/rattrapage UE04 Produit et Storytelling.docx
@@ -11830,6 +11830,23 @@
       </w:r>
     </w:p>
     <w:p/>
+    <w:p/>
+    <w:p/>
+    <w:p/>
+    <w:p>
+      <w:r>
+        <w:t xml:space="preserve">Lien au dépôt Git : </w:t>
+      </w:r>
+      <w:r>
+        <w:rPr>
+          <w:b/>
+          <w:bCs/>
+          <w:sz w:val="28"/>
+          <w:szCs w:val="32"/>
+        </w:rPr>
+        <w:t>https://github.com/YounesBenaggoun/UE04-Produit-et-storytelling</w:t>
+      </w:r>
+    </w:p>
     <w:sectPr>
       <w:pgSz w:w="11906" w:h="16838"/>
       <w:pgMar w:top="720" w:right="720" w:bottom="720" w:left="720" w:header="708" w:footer="708" w:gutter="0"/>

</xml_diff>